<commit_message>
Add "I Just Want to Be Loved", author name, epigraph, and PDF edition
- New Chapter Six, "I Just Want to Be Loved", placed after "The Weight
  of Thinking About You"; original kept verbatim in _editing/originals,
  edited copy changes only until->unless (x4) and two small phrasings
- Author "Aaditya Dike" on the title page, front cover, and metadata
- Author's own quote, lightly improved, as the book's epigraph and the
  back-cover quote; back-cover description updated for the new chapter
- Explicit page layout (title, blank, epigraph, contents, Chapter One on
  a right-hand page) and fixed-height chapter sinks so Word and the PDF
  render identically
- things-i-never-knew-how-to-say_book_ready.pdf exported from the final DOCX
- EDITORIAL_NOTES.md updated

Co-Authored-By: Claude Opus 5.5 <noreply@anthropic.com>
Claude-Session: https://claude.ai/code/session_01RVrwEJFd3aZY9MrpESvKg5
</commit_message>
<xml_diff>
--- a/things-i-never-knew-how-to-say_book_ready.docx
+++ b/things-i-never-knew-how-to-say_book_ready.docx
@@ -17,6 +17,196 @@
       </w:pPr>
       <w:r>
         <w:t xml:space="preserve">Knew How to Say</w:t>
+      </w:r>
+    </w:p>
+    <w:p>
+      <w:pPr>
+        <w:pStyle w:val="FrontSmall"/>
+        <w:spacing w:before="3456"/>
+      </w:pPr>
+      <w:r>
+        <w:t xml:space="preserve">Aaditya Dike</w:t>
+      </w:r>
+    </w:p>
+    <w:p>
+      <w:pPr>
+        <w:pageBreakBefore/>
+        <w:spacing w:after="0"/>
+      </w:pPr>
+    </w:p>
+    <w:p>
+      <w:pPr>
+        <w:keepNext/>
+        <w:pageBreakBefore/>
+        <w:spacing w:after="0" w:before="0" w:line="3312" w:lineRule="exact"/>
+      </w:pPr>
+    </w:p>
+    <w:p>
+      <w:pPr>
+        <w:pStyle w:val="Epigraph"/>
+      </w:pPr>
+      <w:r>
+        <w:t xml:space="preserve">Love doesn’t happen to beautiful people.</w:t>
+      </w:r>
+      <w:r>
+        <w:br/>
+        <w:t xml:space="preserve">It happens —</w:t>
+      </w:r>
+      <w:r>
+        <w:br/>
+        <w:t xml:space="preserve">and then that person becomes beautiful.</w:t>
+      </w:r>
+    </w:p>
+    <w:p>
+      <w:pPr>
+        <w:keepNext/>
+        <w:pageBreakBefore/>
+        <w:spacing w:after="0" w:before="0" w:line="1944" w:lineRule="exact"/>
+      </w:pPr>
+    </w:p>
+    <w:p>
+      <w:pPr>
+        <w:pStyle w:val="ChapterLabel"/>
+        <w:spacing w:after="720"/>
+      </w:pPr>
+      <w:r>
+        <w:t xml:space="preserve">Contents</w:t>
+      </w:r>
+    </w:p>
+    <w:p>
+      <w:pPr>
+        <w:pStyle w:val="ContentsEntry"/>
+      </w:pPr>
+      <w:r>
+        <w:rPr>
+          <w:color w:val="595959"/>
+        </w:rPr>
+        <w:t xml:space="preserve">1</w:t>
+      </w:r>
+      <w:r>
+        <w:t xml:space="preserve">	</w:t>
+      </w:r>
+      <w:r>
+        <w:t xml:space="preserve">24 August — 10:46 a.m.</w:t>
+      </w:r>
+    </w:p>
+    <w:p>
+      <w:pPr>
+        <w:pStyle w:val="ContentsEntry"/>
+      </w:pPr>
+      <w:r>
+        <w:rPr>
+          <w:color w:val="595959"/>
+        </w:rPr>
+        <w:t xml:space="preserve">2</w:t>
+      </w:r>
+      <w:r>
+        <w:t xml:space="preserve">	</w:t>
+      </w:r>
+      <w:r>
+        <w:t xml:space="preserve">27 August</w:t>
+      </w:r>
+    </w:p>
+    <w:p>
+      <w:pPr>
+        <w:pStyle w:val="ContentsEntry"/>
+      </w:pPr>
+      <w:r>
+        <w:rPr>
+          <w:color w:val="595959"/>
+        </w:rPr>
+        <w:t xml:space="preserve">3</w:t>
+      </w:r>
+      <w:r>
+        <w:t xml:space="preserve">	</w:t>
+      </w:r>
+      <w:r>
+        <w:t xml:space="preserve">The Flower I Keep Seeing</w:t>
+      </w:r>
+    </w:p>
+    <w:p>
+      <w:pPr>
+        <w:pStyle w:val="ContentsEntry"/>
+      </w:pPr>
+      <w:r>
+        <w:rPr>
+          <w:color w:val="595959"/>
+        </w:rPr>
+        <w:t xml:space="preserve">4</w:t>
+      </w:r>
+      <w:r>
+        <w:t xml:space="preserve">	</w:t>
+      </w:r>
+      <w:r>
+        <w:t xml:space="preserve">The Flower I Chose Not to Pick</w:t>
+      </w:r>
+    </w:p>
+    <w:p>
+      <w:pPr>
+        <w:pStyle w:val="ContentsEntry"/>
+      </w:pPr>
+      <w:r>
+        <w:rPr>
+          <w:color w:val="595959"/>
+        </w:rPr>
+        <w:t xml:space="preserve">5</w:t>
+      </w:r>
+      <w:r>
+        <w:t xml:space="preserve">	</w:t>
+      </w:r>
+      <w:r>
+        <w:t xml:space="preserve">The Weight of Thinking About You</w:t>
+      </w:r>
+    </w:p>
+    <w:p>
+      <w:pPr>
+        <w:pStyle w:val="ContentsEntry"/>
+      </w:pPr>
+      <w:r>
+        <w:rPr>
+          <w:color w:val="595959"/>
+        </w:rPr>
+        <w:t xml:space="preserve">6</w:t>
+      </w:r>
+      <w:r>
+        <w:t xml:space="preserve">	</w:t>
+      </w:r>
+      <w:r>
+        <w:t xml:space="preserve">I Just Want to Be Loved</w:t>
+      </w:r>
+    </w:p>
+    <w:p>
+      <w:pPr>
+        <w:pStyle w:val="ContentsEntry"/>
+      </w:pPr>
+      <w:r>
+        <w:rPr>
+          <w:color w:val="595959"/>
+        </w:rPr>
+        <w:t xml:space="preserve">7</w:t>
+      </w:r>
+      <w:r>
+        <w:t xml:space="preserve">	</w:t>
+      </w:r>
+      <w:r>
+        <w:t xml:space="preserve">The Love I Could Never Explain</w:t>
+      </w:r>
+    </w:p>
+    <w:p>
+      <w:pPr>
+        <w:pStyle w:val="ContentsEntry"/>
+      </w:pPr>
+      <w:r>
+        <w:rPr>
+          <w:color w:val="595959"/>
+        </w:rPr>
+        <w:t xml:space="preserve">8</w:t>
+      </w:r>
+      <w:r>
+        <w:t xml:space="preserve">	</w:t>
+      </w:r>
+      <w:r>
+        <w:t xml:space="preserve">Will She Ever Understand?</w:t>
       </w:r>
     </w:p>
     <w:p>
@@ -32,142 +222,8 @@
     </w:p>
     <w:p>
       <w:pPr>
-        <w:pStyle w:val="ChapterLabel"/>
-        <w:spacing w:after="720" w:before="1944"/>
-      </w:pPr>
-      <w:r>
-        <w:t xml:space="preserve">Contents</w:t>
-      </w:r>
-    </w:p>
-    <w:p>
-      <w:pPr>
-        <w:pStyle w:val="ContentsEntry"/>
-      </w:pPr>
-      <w:r>
-        <w:rPr>
-          <w:color w:val="595959"/>
-        </w:rPr>
-        <w:t xml:space="preserve">1</w:t>
-      </w:r>
-      <w:r>
-        <w:t xml:space="preserve">	</w:t>
-      </w:r>
-      <w:r>
-        <w:t xml:space="preserve">24 August — 10:46 a.m.</w:t>
-      </w:r>
-    </w:p>
-    <w:p>
-      <w:pPr>
-        <w:pStyle w:val="ContentsEntry"/>
-      </w:pPr>
-      <w:r>
-        <w:rPr>
-          <w:color w:val="595959"/>
-        </w:rPr>
-        <w:t xml:space="preserve">2</w:t>
-      </w:r>
-      <w:r>
-        <w:t xml:space="preserve">	</w:t>
-      </w:r>
-      <w:r>
-        <w:t xml:space="preserve">27 August</w:t>
-      </w:r>
-    </w:p>
-    <w:p>
-      <w:pPr>
-        <w:pStyle w:val="ContentsEntry"/>
-      </w:pPr>
-      <w:r>
-        <w:rPr>
-          <w:color w:val="595959"/>
-        </w:rPr>
-        <w:t xml:space="preserve">3</w:t>
-      </w:r>
-      <w:r>
-        <w:t xml:space="preserve">	</w:t>
-      </w:r>
-      <w:r>
-        <w:t xml:space="preserve">The Flower I Keep Seeing</w:t>
-      </w:r>
-    </w:p>
-    <w:p>
-      <w:pPr>
-        <w:pStyle w:val="ContentsEntry"/>
-      </w:pPr>
-      <w:r>
-        <w:rPr>
-          <w:color w:val="595959"/>
-        </w:rPr>
-        <w:t xml:space="preserve">4</w:t>
-      </w:r>
-      <w:r>
-        <w:t xml:space="preserve">	</w:t>
-      </w:r>
-      <w:r>
-        <w:t xml:space="preserve">The Flower I Chose Not to Pick</w:t>
-      </w:r>
-    </w:p>
-    <w:p>
-      <w:pPr>
-        <w:pStyle w:val="ContentsEntry"/>
-      </w:pPr>
-      <w:r>
-        <w:rPr>
-          <w:color w:val="595959"/>
-        </w:rPr>
-        <w:t xml:space="preserve">5</w:t>
-      </w:r>
-      <w:r>
-        <w:t xml:space="preserve">	</w:t>
-      </w:r>
-      <w:r>
-        <w:t xml:space="preserve">The Weight of Thinking About You</w:t>
-      </w:r>
-    </w:p>
-    <w:p>
-      <w:pPr>
-        <w:pStyle w:val="ContentsEntry"/>
-      </w:pPr>
-      <w:r>
-        <w:rPr>
-          <w:color w:val="595959"/>
-        </w:rPr>
-        <w:t xml:space="preserve">6</w:t>
-      </w:r>
-      <w:r>
-        <w:t xml:space="preserve">	</w:t>
-      </w:r>
-      <w:r>
-        <w:t xml:space="preserve">The Love I Could Never Explain</w:t>
-      </w:r>
-    </w:p>
-    <w:p>
-      <w:pPr>
-        <w:pStyle w:val="ContentsEntry"/>
-      </w:pPr>
-      <w:r>
-        <w:rPr>
-          <w:color w:val="595959"/>
-        </w:rPr>
-        <w:t xml:space="preserve">7</w:t>
-      </w:r>
-      <w:r>
-        <w:t xml:space="preserve">	</w:t>
-      </w:r>
-      <w:r>
-        <w:t xml:space="preserve">Will She Ever Understand?</w:t>
-      </w:r>
-    </w:p>
-    <w:p>
-      <w:pPr>
-        <w:sectPr>
-          <w:footerReference w:type="default" r:id="rId8"/>
-          <w:type w:val="oddPage"/>
-          <w:pgSz w:w="7920" w:h="12240" w:orient="portrait"/>
-          <w:pgMar w:top="1152" w:right="936" w:bottom="1224" w:left="1260" w:header="576" w:footer="648" w:gutter="0"/>
-          <w:pgNumType/>
-          <w:docGrid w:linePitch="360"/>
-        </w:sectPr>
+        <w:keepNext/>
+        <w:spacing w:after="0" w:before="0" w:line="1944" w:lineRule="exact"/>
       </w:pPr>
     </w:p>
     <w:p>
@@ -2496,11 +2552,10 @@
     </w:p>
     <w:p>
       <w:pPr>
-        <w:spacing w:after="0"/>
-      </w:pPr>
-      <w:r>
-        <w:br w:type="page"/>
-      </w:r>
+        <w:keepNext/>
+        <w:pageBreakBefore/>
+        <w:spacing w:after="0" w:before="0" w:line="1944" w:lineRule="exact"/>
+      </w:pPr>
     </w:p>
     <w:p>
       <w:pPr>
@@ -3976,11 +4031,10 @@
     </w:p>
     <w:p>
       <w:pPr>
-        <w:spacing w:after="0"/>
-      </w:pPr>
-      <w:r>
-        <w:br w:type="page"/>
-      </w:r>
+        <w:keepNext/>
+        <w:pageBreakBefore/>
+        <w:spacing w:after="0" w:before="0" w:line="1944" w:lineRule="exact"/>
+      </w:pPr>
     </w:p>
     <w:p>
       <w:pPr>
@@ -5481,11 +5535,10 @@
     </w:p>
     <w:p>
       <w:pPr>
-        <w:spacing w:after="0"/>
-      </w:pPr>
-      <w:r>
-        <w:br w:type="page"/>
-      </w:r>
+        <w:keepNext/>
+        <w:pageBreakBefore/>
+        <w:spacing w:after="0" w:before="0" w:line="1944" w:lineRule="exact"/>
+      </w:pPr>
     </w:p>
     <w:p>
       <w:pPr>
@@ -7113,11 +7166,10 @@
     </w:p>
     <w:p>
       <w:pPr>
-        <w:spacing w:after="0"/>
-      </w:pPr>
-      <w:r>
-        <w:br w:type="page"/>
-      </w:r>
+        <w:keepNext/>
+        <w:pageBreakBefore/>
+        <w:spacing w:after="0" w:before="0" w:line="1944" w:lineRule="exact"/>
+      </w:pPr>
     </w:p>
     <w:p>
       <w:pPr>
@@ -8870,11 +8922,10 @@
     </w:p>
     <w:p>
       <w:pPr>
-        <w:spacing w:after="0"/>
-      </w:pPr>
-      <w:r>
-        <w:br w:type="page"/>
-      </w:r>
+        <w:keepNext/>
+        <w:pageBreakBefore/>
+        <w:spacing w:after="0" w:before="0" w:line="1944" w:lineRule="exact"/>
+      </w:pPr>
     </w:p>
     <w:p>
       <w:pPr>
@@ -8882,6 +8933,549 @@
       </w:pPr>
       <w:r>
         <w:t xml:space="preserve">Chapter Six</w:t>
+      </w:r>
+    </w:p>
+    <w:p>
+      <w:pPr>
+        <w:pStyle w:val="Heading1"/>
+      </w:pPr>
+      <w:r>
+        <w:t xml:space="preserve">I Just Want to Be Loved</w:t>
+      </w:r>
+    </w:p>
+    <w:p>
+      <w:pPr>
+        <w:pStyle w:val="BookBody"/>
+      </w:pPr>
+      <w:r>
+        <w:t xml:space="preserve">I just want to be loved.</w:t>
+      </w:r>
+    </w:p>
+    <w:p>
+      <w:pPr>
+        <w:pStyle w:val="BookBody"/>
+      </w:pPr>
+      <w:r>
+        <w:t xml:space="preserve">That’s it. Nothing else.</w:t>
+      </w:r>
+    </w:p>
+    <w:p>
+      <w:pPr>
+        <w:pStyle w:val="BookBody"/>
+      </w:pPr>
+      <w:r>
+        <w:t xml:space="preserve">I think if I get love, I would cross seven seas for that person. I would love that person more than I love myself. But the condition is simple: that person should love me more than I love them.</w:t>
+      </w:r>
+    </w:p>
+    <w:p>
+      <w:pPr>
+        <w:pStyle w:val="BookBody"/>
+      </w:pPr>
+      <w:r>
+        <w:t xml:space="preserve">Is it too much to ask?</w:t>
+      </w:r>
+    </w:p>
+    <w:p>
+      <w:pPr>
+        <w:pStyle w:val="BookBody"/>
+      </w:pPr>
+      <w:r>
+        <w:t xml:space="preserve">Maybe.</w:t>
+      </w:r>
+    </w:p>
+    <w:p>
+      <w:pPr>
+        <w:pStyle w:val="BookBody"/>
+      </w:pPr>
+      <w:r>
+        <w:t xml:space="preserve">I always say that no one will take care of me, think about me, or worry about me more than my mother. And honestly, I don’t just mean me. I feel like this is true for everyone.</w:t>
+      </w:r>
+    </w:p>
+    <w:p>
+      <w:pPr>
+        <w:pStyle w:val="BookBody"/>
+      </w:pPr>
+      <w:r>
+        <w:t xml:space="preserve">But now I feel like no one will take care of you, think about you, or worry about you at all unless you are useful to them. Unless their needs are being fulfilled. Unless they are getting some benefit from you. Unless you are convenient for them.</w:t>
+      </w:r>
+    </w:p>
+    <w:p>
+      <w:pPr>
+        <w:pStyle w:val="BookBody"/>
+      </w:pPr>
+      <w:r>
+        <w:t xml:space="preserve">Today, people fake everything.</w:t>
+      </w:r>
+    </w:p>
+    <w:p>
+      <w:pPr>
+        <w:pStyle w:val="BookBody"/>
+      </w:pPr>
+      <w:r>
+        <w:t xml:space="preserve">Every emotion they show. Every word they say. They lie.</w:t>
+      </w:r>
+    </w:p>
+    <w:p>
+      <w:pPr>
+        <w:pStyle w:val="BookBody"/>
+      </w:pPr>
+      <w:r>
+        <w:t xml:space="preserve">And I just hate lies.</w:t>
+      </w:r>
+    </w:p>
+    <w:p>
+      <w:pPr>
+        <w:pStyle w:val="BookBody"/>
+      </w:pPr>
+      <w:r>
+        <w:t xml:space="preserve">Why do people even lie?</w:t>
+      </w:r>
+    </w:p>
+    <w:p>
+      <w:pPr>
+        <w:pStyle w:val="BookBody"/>
+      </w:pPr>
+      <w:r>
+        <w:t xml:space="preserve">Why do people break the trust of someone who trusted them with their whole heart?</w:t>
+      </w:r>
+    </w:p>
+    <w:p>
+      <w:pPr>
+        <w:pStyle w:val="BookBody"/>
+      </w:pPr>
+      <w:r>
+        <w:t xml:space="preserve">Why?</w:t>
+      </w:r>
+    </w:p>
+    <w:p>
+      <w:pPr>
+        <w:pStyle w:val="BookBody"/>
+      </w:pPr>
+      <w:r>
+        <w:t xml:space="preserve">I really feel like I’m walking among people who wear masks and costumes. They are so different on the inside. They are not who they pretend to be, and maybe they aren’t even who they want to be.</w:t>
+      </w:r>
+    </w:p>
+    <w:p>
+      <w:pPr>
+        <w:pStyle w:val="BookBody"/>
+      </w:pPr>
+      <w:r>
+        <w:t xml:space="preserve">They are just selfish.</w:t>
+      </w:r>
+    </w:p>
+    <w:p>
+      <w:pPr>
+        <w:pStyle w:val="BookBody"/>
+      </w:pPr>
+      <w:r>
+        <w:t xml:space="preserve">They want attention. They want all the love a person has to offer. And once they have taken all of it, once they feel like they have had enough, they go away.</w:t>
+      </w:r>
+    </w:p>
+    <w:p>
+      <w:pPr>
+        <w:pStyle w:val="BookBody"/>
+      </w:pPr>
+      <w:r>
+        <w:t xml:space="preserve">They leave you.</w:t>
+      </w:r>
+    </w:p>
+    <w:p>
+      <w:pPr>
+        <w:pStyle w:val="BookBody"/>
+      </w:pPr>
+      <w:r>
+        <w:t xml:space="preserve">And they move forward like nothing ever happened.</w:t>
+      </w:r>
+    </w:p>
+    <w:p>
+      <w:pPr>
+        <w:pStyle w:val="BookBody"/>
+      </w:pPr>
+      <w:r>
+        <w:t xml:space="preserve">Why do people act selfish?</w:t>
+      </w:r>
+    </w:p>
+    <w:p>
+      <w:pPr>
+        <w:pStyle w:val="BookBody"/>
+      </w:pPr>
+      <w:r>
+        <w:t xml:space="preserve">Why don’t they think about the people who care about them? The people who love them? The people who worry about them?</w:t>
+      </w:r>
+    </w:p>
+    <w:p>
+      <w:pPr>
+        <w:pStyle w:val="BookBody"/>
+      </w:pPr>
+      <w:r>
+        <w:t xml:space="preserve">Why?</w:t>
+      </w:r>
+    </w:p>
+    <w:p>
+      <w:pPr>
+        <w:pStyle w:val="BookBody"/>
+      </w:pPr>
+      <w:r>
+        <w:t xml:space="preserve">Or is it normal to just think about yourself? To become selfish and do only what you want? To act like none of it matters? To feel nothing for the other person?</w:t>
+      </w:r>
+    </w:p>
+    <w:p>
+      <w:pPr>
+        <w:pStyle w:val="BookBody"/>
+      </w:pPr>
+      <w:r>
+        <w:t xml:space="preserve">Sometimes I wish I could have become like them.</w:t>
+      </w:r>
+    </w:p>
+    <w:p>
+      <w:pPr>
+        <w:pStyle w:val="BookBody"/>
+      </w:pPr>
+      <w:r>
+        <w:t xml:space="preserve">Maybe then I wouldn’t have to suffer this much.</w:t>
+      </w:r>
+    </w:p>
+    <w:p>
+      <w:pPr>
+        <w:pStyle w:val="BookBody"/>
+      </w:pPr>
+      <w:r>
+        <w:t xml:space="preserve">I wouldn’t have to get hurt.</w:t>
+      </w:r>
+    </w:p>
+    <w:p>
+      <w:pPr>
+        <w:pStyle w:val="BookBody"/>
+      </w:pPr>
+      <w:r>
+        <w:t xml:space="preserve">I wouldn’t have to tear up like I am right now.</w:t>
+      </w:r>
+    </w:p>
+    <w:p>
+      <w:pPr>
+        <w:pStyle w:val="BookBody"/>
+      </w:pPr>
+      <w:r>
+        <w:t xml:space="preserve">I can’t bear this any longer.</w:t>
+      </w:r>
+    </w:p>
+    <w:p>
+      <w:pPr>
+        <w:pStyle w:val="BookBody"/>
+      </w:pPr>
+      <w:r>
+        <w:t xml:space="preserve">I feel so much for the people who are closest to me. I care about them. I worry about them. I love them so much that they probably can’t even imagine it.</w:t>
+      </w:r>
+    </w:p>
+    <w:p>
+      <w:pPr>
+        <w:pStyle w:val="BookBody"/>
+      </w:pPr>
+      <w:r>
+        <w:t xml:space="preserve">But why don’t they understand that?</w:t>
+      </w:r>
+    </w:p>
+    <w:p>
+      <w:pPr>
+        <w:pStyle w:val="BookBody"/>
+      </w:pPr>
+      <w:r>
+        <w:t xml:space="preserve">Why do they think this is normal?</w:t>
+      </w:r>
+    </w:p>
+    <w:p>
+      <w:pPr>
+        <w:pStyle w:val="BookBody"/>
+      </w:pPr>
+      <w:r>
+        <w:t xml:space="preserve">And now, again, I think I am being too harsh on myself.</w:t>
+      </w:r>
+    </w:p>
+    <w:p>
+      <w:pPr>
+        <w:pStyle w:val="BookBody"/>
+      </w:pPr>
+      <w:r>
+        <w:t xml:space="preserve">Why was I even born in this generation, where it feels like people don’t care about each other?</w:t>
+      </w:r>
+    </w:p>
+    <w:p>
+      <w:pPr>
+        <w:pStyle w:val="BookBody"/>
+      </w:pPr>
+      <w:r>
+        <w:t xml:space="preserve">Or why did I become like this?</w:t>
+      </w:r>
+    </w:p>
+    <w:p>
+      <w:pPr>
+        <w:pStyle w:val="BookBody"/>
+      </w:pPr>
+      <w:r>
+        <w:t xml:space="preserve">This emotional fool.</w:t>
+      </w:r>
+    </w:p>
+    <w:p>
+      <w:pPr>
+        <w:pStyle w:val="BookBody"/>
+      </w:pPr>
+      <w:r>
+        <w:t xml:space="preserve">No.</w:t>
+      </w:r>
+    </w:p>
+    <w:p>
+      <w:pPr>
+        <w:pStyle w:val="BookBody"/>
+      </w:pPr>
+      <w:r>
+        <w:t xml:space="preserve">I’m a joker in this generation.</w:t>
+      </w:r>
+    </w:p>
+    <w:p>
+      <w:pPr>
+        <w:pStyle w:val="BookBody"/>
+      </w:pPr>
+      <w:r>
+        <w:t xml:space="preserve">I’m blinded by love, and I can’t see the real things right in front of me. I only see the things that love allows me to see. The good things. The things I want to believe in. The things I want to keep safe and happy.</w:t>
+      </w:r>
+    </w:p>
+    <w:p>
+      <w:pPr>
+        <w:pStyle w:val="BookBody"/>
+      </w:pPr>
+      <w:r>
+        <w:t xml:space="preserve">Sometimes I think maybe, in my next life, I’ll be born like these people.</w:t>
+      </w:r>
+    </w:p>
+    <w:p>
+      <w:pPr>
+        <w:pStyle w:val="BookBody"/>
+      </w:pPr>
+      <w:r>
+        <w:t xml:space="preserve">People who don’t care.</w:t>
+      </w:r>
+    </w:p>
+    <w:p>
+      <w:pPr>
+        <w:pStyle w:val="BookBody"/>
+      </w:pPr>
+      <w:r>
+        <w:t xml:space="preserve">People who are selfish.</w:t>
+      </w:r>
+    </w:p>
+    <w:p>
+      <w:pPr>
+        <w:pStyle w:val="BookBody"/>
+      </w:pPr>
+      <w:r>
+        <w:t xml:space="preserve">People who only think about themselves.</w:t>
+      </w:r>
+    </w:p>
+    <w:p>
+      <w:pPr>
+        <w:pStyle w:val="BookBody"/>
+      </w:pPr>
+      <w:r>
+        <w:t xml:space="preserve">Maybe then I wouldn’t get hurt like this.</w:t>
+      </w:r>
+    </w:p>
+    <w:p>
+      <w:pPr>
+        <w:pStyle w:val="BookBody"/>
+      </w:pPr>
+      <w:r>
+        <w:t xml:space="preserve">Or maybe I would just prefer not to be born again.</w:t>
+      </w:r>
+    </w:p>
+    <w:p>
+      <w:pPr>
+        <w:pStyle w:val="BookBody"/>
+      </w:pPr>
+      <w:r>
+        <w:t xml:space="preserve">Because in this cruel world, it feels like you have only two choices.</w:t>
+      </w:r>
+    </w:p>
+    <w:p>
+      <w:pPr>
+        <w:pStyle w:val="BookBody"/>
+      </w:pPr>
+      <w:r>
+        <w:t xml:space="preserve">Either you become cruel,</w:t>
+      </w:r>
+    </w:p>
+    <w:p>
+      <w:pPr>
+        <w:pStyle w:val="BookBody"/>
+      </w:pPr>
+      <w:r>
+        <w:t xml:space="preserve">or you suffer and get hurt every minute.</w:t>
+      </w:r>
+    </w:p>
+    <w:p>
+      <w:pPr>
+        <w:pStyle w:val="BookBody"/>
+      </w:pPr>
+      <w:r>
+        <w:t xml:space="preserve">I’m not angry.</w:t>
+      </w:r>
+    </w:p>
+    <w:p>
+      <w:pPr>
+        <w:pStyle w:val="BookBody"/>
+      </w:pPr>
+      <w:r>
+        <w:t xml:space="preserve">I’m just frustrated.</w:t>
+      </w:r>
+    </w:p>
+    <w:p>
+      <w:pPr>
+        <w:pStyle w:val="BookBody"/>
+      </w:pPr>
+      <w:r>
+        <w:t xml:space="preserve">I genuinely don’t understand why people don’t realize these things. How can someone fake their emotions? How can someone fake caring about another person?</w:t>
+      </w:r>
+    </w:p>
+    <w:p>
+      <w:pPr>
+        <w:pStyle w:val="BookBody"/>
+      </w:pPr>
+      <w:r>
+        <w:t xml:space="preserve">I genuinely don’t know.</w:t>
+      </w:r>
+    </w:p>
+    <w:p>
+      <w:pPr>
+        <w:pStyle w:val="BookBody"/>
+      </w:pPr>
+      <w:r>
+        <w:t xml:space="preserve">When I care about someone, I genuinely care about them.</w:t>
+      </w:r>
+    </w:p>
+    <w:p>
+      <w:pPr>
+        <w:pStyle w:val="BookBody"/>
+      </w:pPr>
+      <w:r>
+        <w:t xml:space="preserve">When I think about them, I genuinely want to know how their day went. I genuinely want to know if they are doing well in their life.</w:t>
+      </w:r>
+    </w:p>
+    <w:p>
+      <w:pPr>
+        <w:pStyle w:val="BookBody"/>
+      </w:pPr>
+      <w:r>
+        <w:t xml:space="preserve">Whatever I do, I do it with my whole heart.</w:t>
+      </w:r>
+    </w:p>
+    <w:p>
+      <w:pPr>
+        <w:pStyle w:val="BookBody"/>
+      </w:pPr>
+      <w:r>
+        <w:t xml:space="preserve">I don’t fake anything.</w:t>
+      </w:r>
+    </w:p>
+    <w:p>
+      <w:pPr>
+        <w:pStyle w:val="BookBody"/>
+      </w:pPr>
+      <w:r>
+        <w:t xml:space="preserve">And I don’t think I’ll ever fake anything.</w:t>
+      </w:r>
+    </w:p>
+    <w:p>
+      <w:pPr>
+        <w:pStyle w:val="BookBody"/>
+      </w:pPr>
+      <w:r>
+        <w:t xml:space="preserve">Not until I die.</w:t>
+      </w:r>
+    </w:p>
+    <w:p>
+      <w:pPr>
+        <w:pStyle w:val="BookBody"/>
+      </w:pPr>
+      <w:r>
+        <w:t xml:space="preserve">No matter how people treat me.</w:t>
+      </w:r>
+    </w:p>
+    <w:p>
+      <w:pPr>
+        <w:pStyle w:val="BookBody"/>
+      </w:pPr>
+      <w:r>
+        <w:t xml:space="preserve">No matter how much they use me.</w:t>
+      </w:r>
+    </w:p>
+    <w:p>
+      <w:pPr>
+        <w:pStyle w:val="BookBody"/>
+      </w:pPr>
+      <w:r>
+        <w:t xml:space="preserve">No matter how much it hurts me.</w:t>
+      </w:r>
+    </w:p>
+    <w:p>
+      <w:pPr>
+        <w:pStyle w:val="BookBody"/>
+      </w:pPr>
+      <w:r>
+        <w:t xml:space="preserve">No matter how much it destroys me.</w:t>
+      </w:r>
+    </w:p>
+    <w:p>
+      <w:pPr>
+        <w:pStyle w:val="BookBody"/>
+      </w:pPr>
+      <w:r>
+        <w:t xml:space="preserve">I’ll stay kind.</w:t>
+      </w:r>
+    </w:p>
+    <w:p>
+      <w:pPr>
+        <w:pStyle w:val="BookBody"/>
+      </w:pPr>
+      <w:r>
+        <w:t xml:space="preserve">I’ll love the people I love.</w:t>
+      </w:r>
+    </w:p>
+    <w:p>
+      <w:pPr>
+        <w:pStyle w:val="BookBody"/>
+      </w:pPr>
+      <w:r>
+        <w:t xml:space="preserve">I’ll still try to make them happy.</w:t>
+      </w:r>
+    </w:p>
+    <w:p>
+      <w:pPr>
+        <w:pStyle w:val="BookBody"/>
+      </w:pPr>
+      <w:r>
+        <w:t xml:space="preserve">Because that’s who I am.</w:t>
+      </w:r>
+    </w:p>
+    <w:p>
+      <w:pPr>
+        <w:pStyle w:val="BookBody"/>
+      </w:pPr>
+      <w:r>
+        <w:t xml:space="preserve">And that’s how my mom and dad raised me.</w:t>
+      </w:r>
+    </w:p>
+    <w:p>
+      <w:pPr>
+        <w:keepNext/>
+        <w:pageBreakBefore/>
+        <w:spacing w:after="0" w:before="0" w:line="1944" w:lineRule="exact"/>
+      </w:pPr>
+    </w:p>
+    <w:p>
+      <w:pPr>
+        <w:pStyle w:val="ChapterLabel"/>
+      </w:pPr>
+      <w:r>
+        <w:t xml:space="preserve">Chapter Seven</w:t>
       </w:r>
     </w:p>
     <w:p>
@@ -10422,18 +11016,17 @@
     </w:p>
     <w:p>
       <w:pPr>
-        <w:spacing w:after="0"/>
-      </w:pPr>
-      <w:r>
-        <w:br w:type="page"/>
-      </w:r>
+        <w:keepNext/>
+        <w:pageBreakBefore/>
+        <w:spacing w:after="0" w:before="0" w:line="1944" w:lineRule="exact"/>
+      </w:pPr>
     </w:p>
     <w:p>
       <w:pPr>
         <w:pStyle w:val="ChapterLabel"/>
       </w:pPr>
       <w:r>
-        <w:t xml:space="preserve">Chapter Seven</w:t>
+        <w:t xml:space="preserve">Chapter Eight</w:t>
       </w:r>
     </w:p>
     <w:p>
@@ -12084,8 +12677,8 @@
       </w:r>
     </w:p>
     <w:sectPr>
-      <w:footerReference w:type="default" r:id="rId9"/>
-      <w:type w:val="oddPage"/>
+      <w:footerReference w:type="default" r:id="rId8"/>
+      <w:type w:val="nextPage"/>
       <w:pgSz w:w="7920" w:h="12240" w:orient="portrait"/>
       <w:pgMar w:top="1152" w:right="936" w:bottom="1224" w:left="1260" w:header="576" w:footer="648" w:gutter="0"/>
       <w:pgNumType w:start="1"/>
@@ -12143,12 +12736,6 @@
 </file>
 
 <file path=word/footer2.xml><?xml version="1.0" encoding="utf-8"?>
-<w:ftr xmlns:wpc="http://schemas.microsoft.com/office/word/2010/wordprocessingCanvas" xmlns:mc="http://schemas.openxmlformats.org/markup-compatibility/2006" xmlns:o="urn:schemas-microsoft-com:office:office" xmlns:r="http://schemas.openxmlformats.org/officeDocument/2006/relationships" xmlns:m="http://schemas.openxmlformats.org/officeDocument/2006/math" xmlns:v="urn:schemas-microsoft-com:vml" xmlns:wp14="http://schemas.microsoft.com/office/word/2010/wordprocessingDrawing" xmlns:wp="http://schemas.openxmlformats.org/drawingml/2006/wordprocessingDrawing" xmlns:w10="urn:schemas-microsoft-com:office:word" xmlns:w="http://schemas.openxmlformats.org/wordprocessingml/2006/main" xmlns:w14="http://schemas.microsoft.com/office/word/2010/wordml" xmlns:w15="http://schemas.microsoft.com/office/word/2012/wordml" xmlns:wpg="http://schemas.microsoft.com/office/word/2010/wordprocessingGroup" xmlns:wpi="http://schemas.microsoft.com/office/word/2010/wordprocessingInk" xmlns:wne="http://schemas.microsoft.com/office/word/2006/wordml" xmlns:wps="http://schemas.microsoft.com/office/word/2010/wordprocessingShape">
-  <w:p/>
-</w:ftr>
-</file>
-
-<file path=word/footer3.xml><?xml version="1.0" encoding="utf-8"?>
 <w:ftr xmlns:wpc="http://schemas.microsoft.com/office/word/2010/wordprocessingCanvas" xmlns:mc="http://schemas.openxmlformats.org/markup-compatibility/2006" xmlns:o="urn:schemas-microsoft-com:office:office" xmlns:r="http://schemas.openxmlformats.org/officeDocument/2006/relationships" xmlns:m="http://schemas.openxmlformats.org/officeDocument/2006/math" xmlns:v="urn:schemas-microsoft-com:vml" xmlns:wp14="http://schemas.microsoft.com/office/word/2010/wordprocessingDrawing" xmlns:wp="http://schemas.openxmlformats.org/drawingml/2006/wordprocessingDrawing" xmlns:w10="urn:schemas-microsoft-com:office:word" xmlns:w="http://schemas.openxmlformats.org/wordprocessingml/2006/main" xmlns:w14="http://schemas.microsoft.com/office/word/2010/wordml" xmlns:w15="http://schemas.microsoft.com/office/word/2012/wordml" xmlns:wpg="http://schemas.microsoft.com/office/word/2010/wordprocessingGroup" xmlns:wpi="http://schemas.microsoft.com/office/word/2010/wordprocessingInk" xmlns:wne="http://schemas.microsoft.com/office/word/2006/wordml" xmlns:wps="http://schemas.microsoft.com/office/word/2010/wordprocessingShape">
   <w:p>
     <w:pPr>
@@ -12533,7 +13120,7 @@
     <w:qFormat/>
     <w:pPr>
       <w:keepNext/>
-      <w:spacing w:after="160" w:before="1944"/>
+      <w:spacing w:after="160" w:before="0"/>
       <w:jc w:val="center"/>
     </w:pPr>
     <w:rPr>
@@ -12597,6 +13184,23 @@
       <w:szCs w:val="18"/>
     </w:rPr>
   </w:style>
+  <w:style w:type="paragraph" w:styleId="Epigraph">
+    <w:name w:val="Epigraph"/>
+    <w:basedOn w:val="Normal"/>
+    <w:qFormat/>
+    <w:pPr>
+      <w:spacing w:after="0" w:before="0" w:line="360" w:lineRule="auto"/>
+      <w:jc w:val="center"/>
+    </w:pPr>
+    <w:rPr>
+      <w:rFonts w:ascii="EB Garamond" w:cs="EB Garamond" w:eastAsia="EB Garamond" w:hAnsi="EB Garamond"/>
+      <w:i/>
+      <w:iCs/>
+      <w:color w:val="333333"/>
+      <w:sz w:val="25"/>
+      <w:szCs w:val="25"/>
+    </w:rPr>
+  </w:style>
   <w:style w:type="paragraph" w:styleId="ContentsEntry">
     <w:name w:val="Contents Entry"/>
     <w:basedOn w:val="Normal"/>

</xml_diff>

<commit_message>
Open the book with "Here is a story" instead of "Here is one more story"
With "24 August" removed, "27 August" opens the book, and its first two
lines said "one more" story / day, pointing back to a chapter that is
gone. At the author's choice, "one more" becomes "a" in both lines.
Rebuild the DOCX, PDF and print-ready PDF (page count unchanged at 83/88)
and record the edit in EDITORIAL_NOTES.md.

Co-Authored-By: Claude Opus 5.5 <noreply@anthropic.com>
Claude-Session: https://claude.ai/code/session_018PmgLX2LhAq3Sc3pppJWGw
</commit_message>
<xml_diff>
--- a/things-i-never-knew-how-to-say_book_ready.docx
+++ b/things-i-never-knew-how-to-say_book_ready.docx
@@ -230,15 +230,15 @@
         <w:pStyle w:val="BookBody"/>
       </w:pPr>
       <w:r>
-        <w:t xml:space="preserve">Here is one more story.</w:t>
-      </w:r>
-    </w:p>
-    <w:p>
-      <w:pPr>
-        <w:pStyle w:val="BookBody"/>
-      </w:pPr>
-      <w:r>
-        <w:t xml:space="preserve">Or maybe just one more day that I don’t want to forget.</w:t>
+        <w:t xml:space="preserve">Here is a story.</w:t>
+      </w:r>
+    </w:p>
+    <w:p>
+      <w:pPr>
+        <w:pStyle w:val="BookBody"/>
+      </w:pPr>
+      <w:r>
+        <w:t xml:space="preserve">Or maybe just a day that I don’t want to forget.</w:t>
       </w:r>
     </w:p>
     <w:p>

</xml_diff>